<commit_message>
Omit repository URL and provide a high-level academic conclusion in LatinR template
</commit_message>
<xml_diff>
--- a/Template_LatinR.docx
+++ b/Template_LatinR.docx
@@ -485,7 +485,7 @@
           <w:color w:val="0C2340"/>
           <w:sz w:val="22"/>
         </w:rPr>
-        <w:t>5. Conclusiones y Reproducibilidad</w:t>
+        <w:t>5. Conclusiones y Discusión</w:t>
       </w:r>
     </w:p>
     <w:p>
@@ -501,7 +501,7 @@
           <w:color w:val="282828"/>
           <w:sz w:val="22"/>
         </w:rPr>
-        <w:t>Este proyecto demuestra la madurez de R y de herramientas de publicación como Quarto para democratizar el análisis cuantitativo de políticas públicas en América Latina. El pipeline completo, incluyendo scripts de consolidación, bases de datos procesadas, figuras exploratorias y el reporte interactivo unificado, se encuentra publicado en un repositorio de código abierto en GitHub (enlace omitido temporalmente para conservar el anonimato durante la evaluación ciego) para su posterior auditoría y réplica por parte de la comunidad científica regional.</w:t>
+        <w:t>Este proyecto demuestra la madurez y potencia de las herramientas de ciencia de datos basadas en R para democratizar y elevar el estándar de los análisis cuantitativos en el diseño de políticas públicas en América Latina. El pipeline unificado permite realizar una caracterización profunda de la economía popular a través de la minería de reglas de asociación con el algoritmo Apriori y la modelación de microdatos oficiales de manera rigurosa, transparente y reproducible de extremo a extremo. Los hallazgos confirman la existencia de una polarización estructural y demuestran cómo la inclusión digital actúa como una variable de alto impacto que potencia las condiciones fiscales y crediticias de los micronegocios. En conclusión, la integración metodológica propuesta provee a los hacedores de política pública de un marco analítico ágil, escalable y basado en evidencia sólida para guiar intervenciones de bajo costo marginal con un máximo impacto socioeconómico en la región.</w:t>
       </w:r>
     </w:p>
     <w:sectPr>

</xml_diff>